<commit_message>
Add PINN benchmark suite with classical baselines and 4th-order priors
</commit_message>
<xml_diff>
--- a/SuperResolution_PINN.docx
+++ b/SuperResolution_PINN.docx
@@ -348,6 +348,9 @@
         <w:pBdr>
           <w:bottom w:val="single" w:sz="4" w:space="1" w:color="DDDDDD"/>
         </w:pBdr>
+        <w:rPr>
+          <w:u w:val="single"/>
+        </w:rPr>
       </w:pPr>
     </w:p>
     <w:p/>
@@ -603,21 +606,7 @@
         <w:rPr>
           <w:color w:val="111111"/>
         </w:rPr>
-        <w:t xml:space="preserve"> ∇</w:t>
-      </w:r>
-      <w:proofErr w:type="spellStart"/>
-      <w:r>
-        <w:rPr>
-          <w:color w:val="111111"/>
-        </w:rPr>
-        <w:t>u_c</w:t>
-      </w:r>
-      <w:proofErr w:type="spellEnd"/>
-      <w:r>
-        <w:rPr>
-          <w:color w:val="111111"/>
-        </w:rPr>
-        <w:t xml:space="preserve"> ∇</w:t>
+        <w:t xml:space="preserve"> ∇u_c ∇</w:t>
       </w:r>
       <w:proofErr w:type="spellStart"/>
       <w:r>
@@ -1244,6 +1233,9 @@
     <w:p/>
     <w:p>
       <w:r>
+        <w:rPr>
+          <w:noProof/>
+        </w:rPr>
         <w:drawing>
           <wp:inline distT="0" distB="0" distL="0" distR="0" wp14:anchorId="7D95CBDE" wp14:editId="4BE49D46">
             <wp:extent cx="5731510" cy="3888740"/>
@@ -2030,39 +2022,26 @@
         </w:rPr>
         <w:t xml:space="preserve">:  </w:t>
       </w:r>
-      <w:r>
-        <w:fldChar w:fldCharType="begin"/>
-      </w:r>
-      <w:r>
-        <w:rPr>
-          <w:lang w:val="en-US"/>
-        </w:rPr>
-        <w:instrText>HYPERLINK "https://github.com/maziarraissi/PINNs"</w:instrText>
-      </w:r>
-      <w:r>
-        <w:fldChar w:fldCharType="separate"/>
-      </w:r>
-      <w:proofErr w:type="spellStart"/>
-      <w:r>
-        <w:rPr>
-          <w:color w:val="2563EB"/>
-          <w:u w:val="single"/>
-          <w:lang w:val="en-US"/>
-        </w:rPr>
-        <w:t>Raissi</w:t>
-      </w:r>
-      <w:proofErr w:type="spellEnd"/>
-      <w:r>
-        <w:rPr>
-          <w:color w:val="2563EB"/>
-          <w:u w:val="single"/>
-          <w:lang w:val="en-US"/>
-        </w:rPr>
-        <w:t xml:space="preserve"> et al. — Physics-Informed Neural Networks (GitHub)</w:t>
-      </w:r>
-      <w:r>
-        <w:fldChar w:fldCharType="end"/>
-      </w:r>
+      <w:hyperlink r:id="rId17" w:history="1">
+        <w:proofErr w:type="spellStart"/>
+        <w:r>
+          <w:rPr>
+            <w:color w:val="2563EB"/>
+            <w:u w:val="single"/>
+            <w:lang w:val="en-US"/>
+          </w:rPr>
+          <w:t>Raissi</w:t>
+        </w:r>
+        <w:proofErr w:type="spellEnd"/>
+        <w:r>
+          <w:rPr>
+            <w:color w:val="2563EB"/>
+            <w:u w:val="single"/>
+            <w:lang w:val="en-US"/>
+          </w:rPr>
+          <w:t xml:space="preserve"> et al. — Physics-Informed Neural Networks (GitHub)</w:t>
+        </w:r>
+      </w:hyperlink>
     </w:p>
     <w:p>
       <w:pPr>
@@ -2380,7 +2359,7 @@
         </w:rPr>
         <w:t xml:space="preserve"> Depth SR (molto vicino a questo approccio):  </w:t>
       </w:r>
-      <w:hyperlink r:id="rId17" w:history="1">
+      <w:hyperlink r:id="rId18" w:history="1">
         <w:r>
           <w:rPr>
             <w:color w:val="2563EB"/>
@@ -2430,7 +2409,7 @@
         </w:rPr>
         <w:t xml:space="preserve"> con struttura non lineare:  </w:t>
       </w:r>
-      <w:hyperlink r:id="rId18" w:history="1">
+      <w:hyperlink r:id="rId19" w:history="1">
         <w:r>
           <w:rPr>
             <w:color w:val="2563EB"/>
@@ -2462,7 +2441,7 @@
         </w:rPr>
         <w:t xml:space="preserve"> con diffusione rinforzata:  </w:t>
       </w:r>
-      <w:hyperlink r:id="rId19" w:history="1">
+      <w:hyperlink r:id="rId20" w:history="1">
         <w:proofErr w:type="spellStart"/>
         <w:r>
           <w:rPr>
@@ -2784,29 +2763,16 @@
         </w:rPr>
         <w:t xml:space="preserve"> x4):  </w:t>
       </w:r>
-      <w:r>
-        <w:fldChar w:fldCharType="begin"/>
-      </w:r>
-      <w:r>
-        <w:rPr>
-          <w:lang w:val="en-US"/>
-        </w:rPr>
-        <w:instrText>HYPERLINK "https://openaccess.thecvf.com/content/CVPR2025W/NTIRE/papers/Chen_NTIRE_2025_Challenge_on_Image_Super-Resolution_x4_Methods_and_Results_CVPRW_2025_paper.pdf"</w:instrText>
-      </w:r>
-      <w:r>
-        <w:fldChar w:fldCharType="separate"/>
-      </w:r>
-      <w:r>
-        <w:rPr>
-          <w:color w:val="2563EB"/>
-          <w:u w:val="single"/>
-          <w:lang w:val="en-US"/>
-        </w:rPr>
-        <w:t>CVPR Workshop Paper</w:t>
-      </w:r>
-      <w:r>
-        <w:fldChar w:fldCharType="end"/>
-      </w:r>
+      <w:hyperlink r:id="rId21" w:history="1">
+        <w:r>
+          <w:rPr>
+            <w:color w:val="2563EB"/>
+            <w:u w:val="single"/>
+            <w:lang w:val="en-US"/>
+          </w:rPr>
+          <w:t>CVPR Workshop Paper</w:t>
+        </w:r>
+      </w:hyperlink>
     </w:p>
     <w:p>
       <w:pPr>
@@ -2838,7 +2804,7 @@
         </w:rPr>
         <w:t xml:space="preserve"> Models per SR:  </w:t>
       </w:r>
-      <w:hyperlink r:id="rId20" w:history="1">
+      <w:hyperlink r:id="rId22" w:history="1">
         <w:r>
           <w:rPr>
             <w:color w:val="2563EB"/>
@@ -2975,7 +2941,61 @@
         </w:pBdr>
       </w:pPr>
     </w:p>
-    <w:p/>
+    <w:p>
+      <w:r>
+        <w:rPr>
+          <w:noProof/>
+        </w:rPr>
+        <w:drawing>
+          <wp:inline distT="0" distB="0" distL="0" distR="0" wp14:anchorId="2C3A9487" wp14:editId="69A11F50">
+            <wp:extent cx="5730240" cy="2057400"/>
+            <wp:effectExtent l="0" t="0" r="3810" b="0"/>
+            <wp:docPr id="1728116839" name="Immagine 2"/>
+            <wp:cNvGraphicFramePr>
+              <a:graphicFrameLocks xmlns:a="http://schemas.openxmlformats.org/drawingml/2006/main" noChangeAspect="1"/>
+            </wp:cNvGraphicFramePr>
+            <a:graphic xmlns:a="http://schemas.openxmlformats.org/drawingml/2006/main">
+              <a:graphicData uri="http://schemas.openxmlformats.org/drawingml/2006/picture">
+                <pic:pic xmlns:pic="http://schemas.openxmlformats.org/drawingml/2006/picture">
+                  <pic:nvPicPr>
+                    <pic:cNvPr id="0" name="Picture 2"/>
+                    <pic:cNvPicPr>
+                      <a:picLocks noChangeAspect="1" noChangeArrowheads="1"/>
+                    </pic:cNvPicPr>
+                  </pic:nvPicPr>
+                  <pic:blipFill>
+                    <a:blip r:embed="rId23">
+                      <a:extLst>
+                        <a:ext uri="{28A0092B-C50C-407E-A947-70E740481C1C}">
+                          <a14:useLocalDpi xmlns:a14="http://schemas.microsoft.com/office/drawing/2010/main" val="0"/>
+                        </a:ext>
+                      </a:extLst>
+                    </a:blip>
+                    <a:srcRect/>
+                    <a:stretch>
+                      <a:fillRect/>
+                    </a:stretch>
+                  </pic:blipFill>
+                  <pic:spPr bwMode="auto">
+                    <a:xfrm>
+                      <a:off x="0" y="0"/>
+                      <a:ext cx="5730240" cy="2057400"/>
+                    </a:xfrm>
+                    <a:prstGeom prst="rect">
+                      <a:avLst/>
+                    </a:prstGeom>
+                    <a:noFill/>
+                    <a:ln>
+                      <a:noFill/>
+                    </a:ln>
+                  </pic:spPr>
+                </pic:pic>
+              </a:graphicData>
+            </a:graphic>
+          </wp:inline>
+        </w:drawing>
+      </w:r>
+    </w:p>
     <w:p>
       <w:r>
         <w:rPr>
@@ -2987,7 +3007,7 @@
       </w:r>
     </w:p>
     <w:sectPr>
-      <w:headerReference w:type="default" r:id="rId21"/>
+      <w:headerReference w:type="default" r:id="rId24"/>
       <w:pgSz w:w="11906" w:h="16838"/>
       <w:pgMar w:top="1440" w:right="1440" w:bottom="1440" w:left="1440" w:header="708" w:footer="708" w:gutter="0"/>
       <w:cols w:space="720"/>

</xml_diff>